<commit_message>
docs: ubah kontrak menjadi perjanjian penyediaan aplikasi (pemilik Hydromart dan penyedia aplikasi)
Co-Authored-By: Claude Sonnet 5.5 <noreply@anthropic.com>
Claude-Session: https://claude.ai/code/session_015tvbBP731S6M4VNhnF6uVc
</commit_message>
<xml_diff>
--- a/docs/KONTRAK_KERJASAMA_HYDROMART.docx
+++ b/docs/KONTRAK_KERJASAMA_HYDROMART.docx
@@ -14,7 +14,7 @@
           <w:sz w:val="28"/>
           <w:szCs w:val="28"/>
         </w:rPr>
-        <w:t xml:space="preserve">PERJANJIAN KERJASAMA KEMITRAAN DEPOT</w:t>
+        <w:t xml:space="preserve">PERJANJIAN PENYEDIAAN DAN PENGEMBANGAN APLIKASI HYDROMART</w:t>
       </w:r>
     </w:p>
     <w:p>
@@ -46,7 +46,7 @@
         <w:jc w:val="both"/>
       </w:pPr>
       <w:r>
-        <w:t xml:space="preserve">[Nama perusahaan Hydromart], berkedudukan di [alamat], diwakili oleh [nama] selaku [jabatan], selanjutnya disebut PIHAK PERTAMA.</w:t>
+        <w:t xml:space="preserve">[Nama pemilik/perusahaan Hydromart], beralamat di [alamat], NIK/NPWP [nomor], diwakili oleh [nama] selaku [jabatan], selanjutnya disebut PIHAK PERTAMA (Pemilik Hydromart).</w:t>
       </w:r>
     </w:p>
     <w:p>
@@ -60,7 +60,7 @@
         <w:jc w:val="both"/>
       </w:pPr>
       <w:r>
-        <w:t xml:space="preserve">[Nama Mitra / badan usaha], beralamat di [alamat], NIK/NPWP [nomor], diwakili oleh [nama] selaku [jabatan], selanjutnya disebut PIHAK KEDUA.</w:t>
+        <w:t xml:space="preserve">[Nama penyedia aplikasi / badan usaha], beralamat di [alamat], NIK/NPWP [nomor], diwakili oleh [nama] selaku [jabatan], selanjutnya disebut PIHAK KEDUA (Penyedia Aplikasi).</w:t>
       </w:r>
     </w:p>
     <w:p>
@@ -93,7 +93,7 @@
         <w:jc w:val="both"/>
       </w:pPr>
       <w:r>
-        <w:t xml:space="preserve">PIHAK PERTAMA memberi PIHAK KEDUA hak untuk mengoperasikan depot air minum isi ulang bermerek Hydromart di [alamat depot] ("Depot").</w:t>
+        <w:t xml:space="preserve">PIHAK PERTAMA menunjuk PIHAK KEDUA untuk menyediakan, mengembangkan, dan memelihara platform digital Hydromart untuk operasional depot air minum isi ulang ("Aplikasi"), meliputi aplikasi pelanggan (web dan mobile), aplikasi kurir, admin depot, portal waralaba, portal kantor pusat, dan layanan backend pendukungnya.</w:t>
       </w:r>
     </w:p>
     <w:p>
@@ -107,7 +107,7 @@
         <w:jc w:val="both"/>
       </w:pPr>
       <w:r>
-        <w:t xml:space="preserve">Hak tersebut mencakup penggunaan merek, sistem digital Hydromart (aplikasi pelanggan, kurir, admin depot, dan portal mitra), standar operasional, dan pelatihan.</w:t>
+        <w:t xml:space="preserve">Rincian fitur, modul, dan spesifikasi tercantum dalam Lampiran A (Spesifikasi dan Jadwal) yang menjadi bagian tidak terpisahkan dari perjanjian ini.</w:t>
       </w:r>
     </w:p>
     <w:p>
@@ -121,7 +121,7 @@
         <w:jc w:val="both"/>
       </w:pPr>
       <w:r>
-        <w:t xml:space="preserve">Hak ini bersifat non-eksklusif dan tidak dapat dialihkan tanpa persetujuan tertulis PIHAK PERTAMA.</w:t>
+        <w:t xml:space="preserve">PIHAK KEDUA menyediakan hosting dan infrastruktur Aplikasi: [ya, termasuk dalam biaya / tidak, ditanggung PIHAK PERTAMA].</w:t>
       </w:r>
     </w:p>
     <w:p>
@@ -135,7 +135,7 @@
         <w:jc w:val="both"/>
       </w:pPr>
       <w:r>
-        <w:t xml:space="preserve">Wilayah layanan Depot: [radius atau kecamatan].</w:t>
+        <w:t xml:space="preserve">Permintaan fitur di luar Lampiran A dianggap pekerjaan tambahan dan dibiayai terpisah sesuai Pasal 6 ayat 6.</w:t>
       </w:r>
     </w:p>
     <w:p>
@@ -159,7 +159,7 @@
         <w:jc w:val="both"/>
       </w:pPr>
       <w:r>
-        <w:t xml:space="preserve">Perjanjian berlaku selama [jumlah] tahun, sejak [tanggal mulai] sampai [tanggal berakhir].</w:t>
+        <w:t xml:space="preserve">Perjanjian berlaku sejak [tanggal mulai] sampai [tanggal berakhir] ([jumlah] tahun).</w:t>
       </w:r>
     </w:p>
     <w:p>
@@ -173,7 +173,7 @@
         <w:jc w:val="both"/>
       </w:pPr>
       <w:r>
-        <w:t xml:space="preserve">Perpanjangan dilakukan dengan kesepakatan tertulis paling lambat [30/60] hari sebelum perjanjian berakhir.</w:t>
+        <w:t xml:space="preserve">Perpanjangan dilakukan dengan kesepakatan tertulis paling lambat [60] hari sebelum perjanjian berakhir.</w:t>
       </w:r>
     </w:p>
     <w:p>
@@ -183,7 +183,7 @@
         <w:jc w:val="center"/>
       </w:pPr>
       <w:r>
-        <w:t xml:space="preserve">Pasal 3 – Hak dan Kewajiban PIHAK PERTAMA</w:t>
+        <w:t xml:space="preserve">Pasal 3 – Kewajiban PIHAK KEDUA (Penyedia Aplikasi)</w:t>
       </w:r>
     </w:p>
     <w:p>
@@ -197,7 +197,7 @@
         <w:jc w:val="both"/>
       </w:pPr>
       <w:r>
-        <w:t xml:space="preserve">Menyediakan akses ke sistem digital Hydromart, pelatihan awal, dan panduan operasional.</w:t>
+        <w:t xml:space="preserve">Menyerahkan Aplikasi sesuai Lampiran A dan jadwal yang disepakati.</w:t>
       </w:r>
     </w:p>
     <w:p>
@@ -211,7 +211,7 @@
         <w:jc w:val="both"/>
       </w:pPr>
       <w:r>
-        <w:t xml:space="preserve">Memberi dukungan teknis dan pelaporan selama jam kerja yang disepakati.</w:t>
+        <w:t xml:space="preserve">Menjaga ketersediaan Aplikasi minimal [99]% per bulan di luar pemeliharaan terjadwal, dan menangani gangguan kritis dalam [4] jam dan gangguan biasa dalam [2] hari kerja setelah dilaporkan.</w:t>
       </w:r>
     </w:p>
     <w:p>
@@ -225,7 +225,7 @@
         <w:jc w:val="both"/>
       </w:pPr>
       <w:r>
-        <w:t xml:space="preserve">Menjaga mutu merek dan berhak melakukan audit kualitas air dan kebersihan Depot dengan pemberitahuan wajar.</w:t>
+        <w:t xml:space="preserve">Melakukan pencadangan data secara berkala dan menjaga keamanan sistem sesuai praktik yang wajar.</w:t>
       </w:r>
     </w:p>
     <w:p>
@@ -239,7 +239,21 @@
         <w:jc w:val="both"/>
       </w:pPr>
       <w:r>
-        <w:t xml:space="preserve">Berhak menerima pembayaran sebagaimana diatur dalam Pasal 5.</w:t>
+        <w:t xml:space="preserve">Memberi dukungan teknis dan pelatihan kepada PIHAK PERTAMA selama [jam/hari kerja].</w:t>
+      </w:r>
+    </w:p>
+    <w:p>
+      <w:pPr>
+        <w:pStyle w:val="ListParagraph"/>
+        <w:numPr>
+          <w:ilvl w:val="0"/>
+          <w:numId w:val="5"/>
+        </w:numPr>
+        <w:spacing w:after="80"/>
+        <w:jc w:val="both"/>
+      </w:pPr>
+      <w:r>
+        <w:t xml:space="preserve">Melaporkan insiden keamanan atau kebocoran data kepada PIHAK PERTAMA paling lambat [24] jam sejak diketahui.</w:t>
       </w:r>
     </w:p>
     <w:p>
@@ -249,7 +263,7 @@
         <w:jc w:val="center"/>
       </w:pPr>
       <w:r>
-        <w:t xml:space="preserve">Pasal 4 – Hak dan Kewajiban PIHAK KEDUA</w:t>
+        <w:t xml:space="preserve">Pasal 4 – Kewajiban PIHAK PERTAMA (Pemilik Hydromart)</w:t>
       </w:r>
     </w:p>
     <w:p>
@@ -263,7 +277,7 @@
         <w:jc w:val="both"/>
       </w:pPr>
       <w:r>
-        <w:t xml:space="preserve">Mengoperasikan Depot sesuai standar operasional Hydromart dan peraturan perundang-undangan, termasuk perizinan usaha dan uji kualitas air yang dipersyaratkan.</w:t>
+        <w:t xml:space="preserve">Menyediakan informasi, materi, akses, dan keputusan yang dibutuhkan PIHAK KEDUA tepat waktu.</w:t>
       </w:r>
     </w:p>
     <w:p>
@@ -277,7 +291,7 @@
         <w:jc w:val="both"/>
       </w:pPr>
       <w:r>
-        <w:t xml:space="preserve">Mencatat seluruh penjualan, stok, dan pesanan melalui sistem Hydromart, dan tidak menjual produk Hydromart di luar sistem.</w:t>
+        <w:t xml:space="preserve">Melakukan uji penerimaan (UAT) dan memberi persetujuan atau catatan perbaikan tertulis dalam [7] hari kerja sejak penyerahan. Bila tidak ada tanggapan dalam batas itu, hasil pekerjaan dianggap diterima.</w:t>
       </w:r>
     </w:p>
     <w:p>
@@ -291,7 +305,7 @@
         <w:jc w:val="both"/>
       </w:pPr>
       <w:r>
-        <w:t xml:space="preserve">Memakai merek Hydromart hanya di Depot dan untuk keperluan yang disetujui PIHAK PERTAMA.</w:t>
+        <w:t xml:space="preserve">Membayar sesuai Pasal 6.</w:t>
       </w:r>
     </w:p>
     <w:p>
@@ -305,7 +319,7 @@
         <w:jc w:val="both"/>
       </w:pPr>
       <w:r>
-        <w:t xml:space="preserve">Menjaga kerahasiaan data pelanggan, harga, dan sistem Hydromart selama perjanjian dan [2] tahun sesudahnya, serta mematuhi UU Pelindungan Data Pribadi.</w:t>
+        <w:t xml:space="preserve">Bertanggung jawab atas keabsahan data, harga, dan perizinan usaha depot yang dimasukkan ke dalam Aplikasi, serta atas kepatuhan pajak usahanya sendiri (misalnya status PKP dan PPN penjualan ke konsumen).</w:t>
       </w:r>
     </w:p>
     <w:p>
@@ -319,21 +333,7 @@
         <w:jc w:val="both"/>
       </w:pPr>
       <w:r>
-        <w:t xml:space="preserve">Menanggung biaya operasional Depot: sewa, listrik, tenaga kerja, dan perawatan peralatan.</w:t>
-      </w:r>
-    </w:p>
-    <w:p>
-      <w:pPr>
-        <w:pStyle w:val="ListParagraph"/>
-        <w:numPr>
-          <w:ilvl w:val="0"/>
-          <w:numId w:val="6"/>
-        </w:numPr>
-        <w:spacing w:after="80"/>
-        <w:jc w:val="both"/>
-      </w:pPr>
-      <w:r>
-        <w:t xml:space="preserve">Tidak mengoperasikan merek air minum pesaing di Depot selama perjanjian berlaku, kecuali disetujui tertulis.</w:t>
+        <w:t xml:space="preserve">Tidak membongkar, menyalin, atau menjual kembali Aplikasi kepada pihak lain di luar yang diatur perjanjian ini.</w:t>
       </w:r>
     </w:p>
     <w:p>
@@ -343,7 +343,101 @@
         <w:jc w:val="center"/>
       </w:pPr>
       <w:r>
-        <w:t xml:space="preserve">Pasal 5 – Pembayaran</w:t>
+        <w:t xml:space="preserve">Pasal 5 – Hak Kekayaan Intelektual dan Data</w:t>
+      </w:r>
+    </w:p>
+    <w:p>
+      <w:pPr>
+        <w:pStyle w:val="ListParagraph"/>
+        <w:numPr>
+          <w:ilvl w:val="0"/>
+          <w:numId w:val="7"/>
+        </w:numPr>
+        <w:spacing w:after="80"/>
+        <w:jc w:val="both"/>
+      </w:pPr>
+      <w:r>
+        <w:t xml:space="preserve">[Pilih salah satu: (a) Kode sumber dan hak cipta Aplikasi tetap milik PIHAK KEDUA, dan PIHAK PERTAMA menerima lisensi non-eksklusif untuk memakainya selama perjanjian berlaku; atau (b) Hak cipta atas hasil pekerjaan beralih kepada PIHAK PERTAMA setelah pembayaran lunas, kecuali komponen dan pustaka pihak ketiga serta alat bantu milik PIHAK KEDUA.]</w:t>
+      </w:r>
+    </w:p>
+    <w:p>
+      <w:pPr>
+        <w:pStyle w:val="ListParagraph"/>
+        <w:numPr>
+          <w:ilvl w:val="0"/>
+          <w:numId w:val="7"/>
+        </w:numPr>
+        <w:spacing w:after="80"/>
+        <w:jc w:val="both"/>
+      </w:pPr>
+      <w:r>
+        <w:t xml:space="preserve">Merek, nama, logo, dan konten Hydromart tetap milik PIHAK PERTAMA.</w:t>
+      </w:r>
+    </w:p>
+    <w:p>
+      <w:pPr>
+        <w:pStyle w:val="ListParagraph"/>
+        <w:numPr>
+          <w:ilvl w:val="0"/>
+          <w:numId w:val="7"/>
+        </w:numPr>
+        <w:spacing w:after="80"/>
+        <w:jc w:val="both"/>
+      </w:pPr>
+      <w:r>
+        <w:t xml:space="preserve">Seluruh data operasional, pelanggan, pesanan, dan keuangan Hydromart adalah milik PIHAK PERTAMA. PIHAK KEDUA hanya memakainya untuk menjalankan layanan ini.</w:t>
+      </w:r>
+    </w:p>
+    <w:p>
+      <w:pPr>
+        <w:pStyle w:val="ListParagraph"/>
+        <w:numPr>
+          <w:ilvl w:val="0"/>
+          <w:numId w:val="7"/>
+        </w:numPr>
+        <w:spacing w:after="80"/>
+        <w:jc w:val="both"/>
+      </w:pPr>
+      <w:r>
+        <w:t xml:space="preserve">PIHAK KEDUA mematuhi UU Pelindungan Data Pribadi dan tidak mengungkap data tersebut kepada pihak ketiga tanpa persetujuan tertulis, kecuali diwajibkan hukum.</w:t>
+      </w:r>
+    </w:p>
+    <w:p>
+      <w:pPr>
+        <w:pStyle w:val="ListParagraph"/>
+        <w:numPr>
+          <w:ilvl w:val="0"/>
+          <w:numId w:val="7"/>
+        </w:numPr>
+        <w:spacing w:after="80"/>
+        <w:jc w:val="both"/>
+      </w:pPr>
+      <w:r>
+        <w:t xml:space="preserve">Saat perjanjian berakhir, PIHAK KEDUA menyerahkan salinan data PIHAK PERTAMA dalam format yang dapat dibaca dalam [14] hari, lalu menghapus data dari sistemnya sesuai permintaan tertulis.</w:t>
+      </w:r>
+    </w:p>
+    <w:p>
+      <w:pPr>
+        <w:pStyle w:val="ListParagraph"/>
+        <w:numPr>
+          <w:ilvl w:val="0"/>
+          <w:numId w:val="7"/>
+        </w:numPr>
+        <w:spacing w:after="80"/>
+        <w:jc w:val="both"/>
+      </w:pPr>
+      <w:r>
+        <w:t xml:space="preserve">Para Pihak menjaga kerahasiaan informasi non-publik pihak lain selama perjanjian dan [2] tahun sesudahnya.</w:t>
+      </w:r>
+    </w:p>
+    <w:p>
+      <w:pPr>
+        <w:pStyle w:val="Heading2"/>
+        <w:keepNext/>
+        <w:jc w:val="center"/>
+      </w:pPr>
+      <w:r>
+        <w:t xml:space="preserve">Pasal 6 – Biaya dan Pembayaran</w:t>
       </w:r>
     </w:p>
     <w:p>
@@ -352,7 +446,7 @@
         <w:jc w:val="both"/>
       </w:pPr>
       <w:r>
-        <w:t xml:space="preserve">PIHAK KEDUA membayar kepada PIHAK PERTAMA komponen berikut:</w:t>
+        <w:t xml:space="preserve">PIHAK PERTAMA membayar kepada PIHAK KEDUA sebagai berikut:</w:t>
       </w:r>
     </w:p>
     <w:tbl>
@@ -475,7 +569,7 @@
                 <w:b w:val="false"/>
                 <w:bCs w:val="false"/>
               </w:rPr>
-              <w:t xml:space="preserve">Biaya kemitraan awal (sekali bayar)</w:t>
+              <w:t xml:space="preserve">Uang muka pengembangan</w:t>
             </w:r>
           </w:p>
         </w:tc>
@@ -501,7 +595,7 @@
                 <w:b w:val="false"/>
                 <w:bCs w:val="false"/>
               </w:rPr>
-              <w:t xml:space="preserve">Rp [jumlah]</w:t>
+              <w:t xml:space="preserve">[30]% x Rp [total] = Rp [jumlah]</w:t>
             </w:r>
           </w:p>
         </w:tc>
@@ -527,7 +621,7 @@
                 <w:b w:val="false"/>
                 <w:bCs w:val="false"/>
               </w:rPr>
-              <w:t xml:space="preserve">[Paling lambat 7 hari] setelah penandatanganan</w:t>
+              <w:t xml:space="preserve">Paling lambat [7] hari setelah penandatanganan</w:t>
             </w:r>
           </w:p>
         </w:tc>
@@ -555,7 +649,7 @@
                 <w:b w:val="false"/>
                 <w:bCs w:val="false"/>
               </w:rPr>
-              <w:t xml:space="preserve">Royalti bulanan</w:t>
+              <w:t xml:space="preserve">Termin 2 – setelah UAT disetujui</w:t>
             </w:r>
           </w:p>
         </w:tc>
@@ -581,7 +675,7 @@
                 <w:b w:val="false"/>
                 <w:bCs w:val="false"/>
               </w:rPr>
-              <w:t xml:space="preserve">[x]% dari omzet bersih Depot</w:t>
+              <w:t xml:space="preserve">[40]% = Rp [jumlah]</w:t>
             </w:r>
           </w:p>
         </w:tc>
@@ -607,7 +701,7 @@
                 <w:b w:val="false"/>
                 <w:bCs w:val="false"/>
               </w:rPr>
-              <w:t xml:space="preserve">Paling lambat tanggal [10] bulan berikutnya</w:t>
+              <w:t xml:space="preserve">Paling lambat [7] hari setelah berita acara UAT</w:t>
             </w:r>
           </w:p>
         </w:tc>
@@ -635,7 +729,7 @@
                 <w:b w:val="false"/>
                 <w:bCs w:val="false"/>
               </w:rPr>
-              <w:t xml:space="preserve">Biaya langganan sistem digital</w:t>
+              <w:t xml:space="preserve">Termin 3 – go-live</w:t>
             </w:r>
           </w:p>
         </w:tc>
@@ -661,7 +755,7 @@
                 <w:b w:val="false"/>
                 <w:bCs w:val="false"/>
               </w:rPr>
-              <w:t xml:space="preserve">Rp [jumlah] per bulan</w:t>
+              <w:t xml:space="preserve">[30]% = Rp [jumlah]</w:t>
             </w:r>
           </w:p>
         </w:tc>
@@ -687,7 +781,7 @@
                 <w:b w:val="false"/>
                 <w:bCs w:val="false"/>
               </w:rPr>
-              <w:t xml:space="preserve">Paling lambat tanggal [10] setiap bulan</w:t>
+              <w:t xml:space="preserve">Paling lambat [7] hari setelah go-live</w:t>
             </w:r>
           </w:p>
         </w:tc>
@@ -715,7 +809,7 @@
                 <w:b w:val="false"/>
                 <w:bCs w:val="false"/>
               </w:rPr>
-              <w:t xml:space="preserve">Deposit jaminan (opsional)</w:t>
+              <w:t xml:space="preserve">Biaya langganan, hosting, dan pemeliharaan</w:t>
             </w:r>
           </w:p>
         </w:tc>
@@ -741,7 +835,7 @@
                 <w:b w:val="false"/>
                 <w:bCs w:val="false"/>
               </w:rPr>
-              <w:t xml:space="preserve">Rp [jumlah]</w:t>
+              <w:t xml:space="preserve">Rp [jumlah] per bulan</w:t>
             </w:r>
           </w:p>
         </w:tc>
@@ -767,7 +861,7 @@
                 <w:b w:val="false"/>
                 <w:bCs w:val="false"/>
               </w:rPr>
-              <w:t xml:space="preserve">Saat penandatanganan</w:t>
+              <w:t xml:space="preserve">Paling lambat tanggal [10] setiap bulan, mulai [bulan]</w:t>
             </w:r>
           </w:p>
         </w:tc>
@@ -783,83 +877,97 @@
         <w:pStyle w:val="ListParagraph"/>
         <w:numPr>
           <w:ilvl w:val="0"/>
-          <w:numId w:val="7"/>
-        </w:numPr>
-        <w:spacing w:after="80"/>
-        <w:jc w:val="both"/>
-      </w:pPr>
-      <w:r>
-        <w:t xml:space="preserve">Omzet bersih dihitung dari data penjualan yang tercatat di sistem Hydromart, setelah dikurangi retur dan diskon yang disetujui.</w:t>
-      </w:r>
-    </w:p>
-    <w:p>
-      <w:pPr>
-        <w:pStyle w:val="ListParagraph"/>
-        <w:numPr>
-          <w:ilvl w:val="0"/>
-          <w:numId w:val="7"/>
-        </w:numPr>
-        <w:spacing w:after="80"/>
-        <w:jc w:val="both"/>
-      </w:pPr>
-      <w:r>
-        <w:t xml:space="preserve">Pembayaran dilakukan melalui transfer ke rekening PIHAK PERTAMA: [bank], nomor [rekening], atas nama [nama pemilik rekening]. PIHAK PERTAMA menerbitkan bukti pembayaran atau faktur untuk setiap pembayaran.</w:t>
-      </w:r>
-    </w:p>
-    <w:p>
-      <w:pPr>
-        <w:pStyle w:val="ListParagraph"/>
-        <w:numPr>
-          <w:ilvl w:val="0"/>
-          <w:numId w:val="7"/>
-        </w:numPr>
-        <w:spacing w:after="80"/>
-        <w:jc w:val="both"/>
-      </w:pPr>
-      <w:r>
-        <w:t xml:space="preserve">Keterlambatan dikenakan denda [0,1]% per hari dari jumlah terutang, maksimal [10]% dari jumlah tersebut. Keterlambatan lebih dari [30] hari merupakan wanprestasi menurut Pasal 7.</w:t>
-      </w:r>
-    </w:p>
-    <w:p>
-      <w:pPr>
-        <w:pStyle w:val="ListParagraph"/>
-        <w:numPr>
-          <w:ilvl w:val="0"/>
-          <w:numId w:val="7"/>
-        </w:numPr>
-        <w:spacing w:after="80"/>
-        <w:jc w:val="both"/>
-      </w:pPr>
-      <w:r>
-        <w:t xml:space="preserve">Pajak: [PARA PIHAK menanggung pajaknya masing-masing / jumlah di atas belum/sudah termasuk PPN]. Status PKP masing-masing pihak harus dipastikan sebelum penandatanganan.</w:t>
-      </w:r>
-    </w:p>
-    <w:p>
-      <w:pPr>
-        <w:pStyle w:val="ListParagraph"/>
-        <w:numPr>
-          <w:ilvl w:val="0"/>
-          <w:numId w:val="7"/>
-        </w:numPr>
-        <w:spacing w:after="80"/>
-        <w:jc w:val="both"/>
-      </w:pPr>
-      <w:r>
-        <w:t xml:space="preserve">Biaya kemitraan awal [tidak dapat/dapat] dikembalikan. Deposit dikembalikan dalam [30] hari setelah perjanjian berakhir, dikurangi kewajiban yang belum dibayar.</w:t>
-      </w:r>
-    </w:p>
-    <w:p>
-      <w:pPr>
-        <w:pStyle w:val="ListParagraph"/>
-        <w:numPr>
-          <w:ilvl w:val="0"/>
-          <w:numId w:val="7"/>
-        </w:numPr>
-        <w:spacing w:after="80"/>
-        <w:jc w:val="both"/>
-      </w:pPr>
-      <w:r>
-        <w:t xml:space="preserve">Perubahan nilai pembayaran hanya sah bila dibuat tertulis dan ditandatangani PARA PIHAK.</w:t>
+          <w:numId w:val="8"/>
+        </w:numPr>
+        <w:spacing w:after="80"/>
+        <w:jc w:val="both"/>
+      </w:pPr>
+      <w:r>
+        <w:t xml:space="preserve">Total biaya pengembangan adalah Rp [total] ([terbilang]).</w:t>
+      </w:r>
+    </w:p>
+    <w:p>
+      <w:pPr>
+        <w:pStyle w:val="ListParagraph"/>
+        <w:numPr>
+          <w:ilvl w:val="0"/>
+          <w:numId w:val="8"/>
+        </w:numPr>
+        <w:spacing w:after="80"/>
+        <w:jc w:val="both"/>
+      </w:pPr>
+      <w:r>
+        <w:t xml:space="preserve">Pembayaran dilakukan melalui transfer ke rekening PIHAK KEDUA: [bank], nomor [rekening], atas nama [nama pemilik rekening]. PIHAK KEDUA menerbitkan invoice sebelum jatuh tempo dan bukti pembayaran setelah lunas.</w:t>
+      </w:r>
+    </w:p>
+    <w:p>
+      <w:pPr>
+        <w:pStyle w:val="ListParagraph"/>
+        <w:numPr>
+          <w:ilvl w:val="0"/>
+          <w:numId w:val="8"/>
+        </w:numPr>
+        <w:spacing w:after="80"/>
+        <w:jc w:val="both"/>
+      </w:pPr>
+      <w:r>
+        <w:t xml:space="preserve">Keterlambatan dikenakan denda [0,1]% per hari dari jumlah terutang, maksimal [10]% dari jumlah tersebut. Bila tertunggak lebih dari [30] hari, PIHAK KEDUA berhak menangguhkan layanan setelah peringatan tertulis [7] hari, tanpa menghapus data PIHAK PERTAMA.</w:t>
+      </w:r>
+    </w:p>
+    <w:p>
+      <w:pPr>
+        <w:pStyle w:val="ListParagraph"/>
+        <w:numPr>
+          <w:ilvl w:val="0"/>
+          <w:numId w:val="8"/>
+        </w:numPr>
+        <w:spacing w:after="80"/>
+        <w:jc w:val="both"/>
+      </w:pPr>
+      <w:r>
+        <w:t xml:space="preserve">Pajak: [harga belum/sudah termasuk PPN]. PPh atas pembayaran [ditanggung PIHAK PERTAMA / dipotong sesuai ketentuan]. Status PKP masing-masing pihak harus dipastikan sebelum penandatanganan.</w:t>
+      </w:r>
+    </w:p>
+    <w:p>
+      <w:pPr>
+        <w:pStyle w:val="ListParagraph"/>
+        <w:numPr>
+          <w:ilvl w:val="0"/>
+          <w:numId w:val="8"/>
+        </w:numPr>
+        <w:spacing w:after="80"/>
+        <w:jc w:val="both"/>
+      </w:pPr>
+      <w:r>
+        <w:t xml:space="preserve">Biaya pengembangan yang sudah dibayar tidak dapat dikembalikan, kecuali PIHAK KEDUA gagal menyerahkan pekerjaan sebagaimana Pasal 8.</w:t>
+      </w:r>
+    </w:p>
+    <w:p>
+      <w:pPr>
+        <w:pStyle w:val="ListParagraph"/>
+        <w:numPr>
+          <w:ilvl w:val="0"/>
+          <w:numId w:val="8"/>
+        </w:numPr>
+        <w:spacing w:after="80"/>
+        <w:jc w:val="both"/>
+      </w:pPr>
+      <w:r>
+        <w:t xml:space="preserve">Pekerjaan tambahan dihitung dengan tarif Rp [jumlah] per jam atau per hari kerja, atau berdasarkan penawaran tertulis yang disetujui PIHAK PERTAMA lebih dulu.</w:t>
+      </w:r>
+    </w:p>
+    <w:p>
+      <w:pPr>
+        <w:pStyle w:val="ListParagraph"/>
+        <w:numPr>
+          <w:ilvl w:val="0"/>
+          <w:numId w:val="8"/>
+        </w:numPr>
+        <w:spacing w:after="80"/>
+        <w:jc w:val="both"/>
+      </w:pPr>
+      <w:r>
+        <w:t xml:space="preserve">Kenaikan biaya bulanan pada perpanjangan diberitahukan tertulis paling lambat [60] hari sebelumnya dan maksimal [x]% per tahun.</w:t>
       </w:r>
     </w:p>
     <w:p>
@@ -869,16 +977,35 @@
         <w:jc w:val="center"/>
       </w:pPr>
       <w:r>
-        <w:t xml:space="preserve">Pasal 6 – Keadaan Memaksa</w:t>
-      </w:r>
-    </w:p>
-    <w:p>
-      <w:pPr>
-        <w:spacing w:after="120"/>
-        <w:jc w:val="both"/>
-      </w:pPr>
-      <w:r>
-        <w:t xml:space="preserve">Para Pihak dibebaskan dari kewajiban yang terhambat oleh keadaan di luar kendali wajar, seperti bencana alam, kebakaran, wabah, atau kebijakan pemerintah, bila pihak terdampak memberi tahu pihak lain secara tertulis dalam [7] hari. Kewajiban pembayaran yang sudah jatuh tempo sebelum kejadian tetap harus dilunasi.</w:t>
+        <w:t xml:space="preserve">Pasal 7 – Batasan Tanggung Jawab dan Keadaan Memaksa</w:t>
+      </w:r>
+    </w:p>
+    <w:p>
+      <w:pPr>
+        <w:pStyle w:val="ListParagraph"/>
+        <w:numPr>
+          <w:ilvl w:val="0"/>
+          <w:numId w:val="9"/>
+        </w:numPr>
+        <w:spacing w:after="80"/>
+        <w:jc w:val="both"/>
+      </w:pPr>
+      <w:r>
+        <w:t xml:space="preserve">Tanggung jawab total PIHAK KEDUA atas klaim terkait perjanjian ini dibatasi sebesar [jumlah / total biaya yang dibayar dalam 12 bulan terakhir], dan tidak mencakup kehilangan keuntungan tidak langsung, kecuali karena kelalaian berat atau kesengajaan.</w:t>
+      </w:r>
+    </w:p>
+    <w:p>
+      <w:pPr>
+        <w:pStyle w:val="ListParagraph"/>
+        <w:numPr>
+          <w:ilvl w:val="0"/>
+          <w:numId w:val="9"/>
+        </w:numPr>
+        <w:spacing w:after="80"/>
+        <w:jc w:val="both"/>
+      </w:pPr>
+      <w:r>
+        <w:t xml:space="preserve">Para Pihak dibebaskan dari kewajiban yang terhambat oleh keadaan di luar kendali wajar, seperti bencana alam, gangguan listrik atau jaringan penyedia pihak ketiga, wabah, atau kebijakan pemerintah, bila pihak terdampak memberi tahu pihak lain secara tertulis dalam [7] hari. Kewajiban pembayaran yang sudah jatuh tempo tetap harus dilunasi.</w:t>
       </w:r>
     </w:p>
     <w:p>
@@ -888,15 +1015,15 @@
         <w:jc w:val="center"/>
       </w:pPr>
       <w:r>
-        <w:t xml:space="preserve">Pasal 7 – Wanprestasi dan Pengakhiran</w:t>
-      </w:r>
-    </w:p>
-    <w:p>
-      <w:pPr>
-        <w:pStyle w:val="ListParagraph"/>
-        <w:numPr>
-          <w:ilvl w:val="0"/>
-          <w:numId w:val="8"/>
+        <w:t xml:space="preserve">Pasal 8 – Wanprestasi dan Pengakhiran</w:t>
+      </w:r>
+    </w:p>
+    <w:p>
+      <w:pPr>
+        <w:pStyle w:val="ListParagraph"/>
+        <w:numPr>
+          <w:ilvl w:val="0"/>
+          <w:numId w:val="10"/>
         </w:numPr>
         <w:spacing w:after="80"/>
         <w:jc w:val="both"/>
@@ -910,21 +1037,21 @@
         <w:pStyle w:val="ListParagraph"/>
         <w:numPr>
           <w:ilvl w:val="0"/>
-          <w:numId w:val="8"/>
-        </w:numPr>
-        <w:spacing w:after="80"/>
-        <w:jc w:val="both"/>
-      </w:pPr>
-      <w:r>
-        <w:t xml:space="preserve">PIHAK PERTAMA berhak mengakhiri perjanjian segera bila PIHAK KEDUA membahayakan mutu air atau keselamatan konsumen, atau menunggak pembayaran lebih dari [30] hari.</w:t>
-      </w:r>
-    </w:p>
-    <w:p>
-      <w:pPr>
-        <w:pStyle w:val="ListParagraph"/>
-        <w:numPr>
-          <w:ilvl w:val="0"/>
-          <w:numId w:val="8"/>
+          <w:numId w:val="10"/>
+        </w:numPr>
+        <w:spacing w:after="80"/>
+        <w:jc w:val="both"/>
+      </w:pPr>
+      <w:r>
+        <w:t xml:space="preserve">Salah satu pihak dapat mengakhiri perjanjian tanpa alasan dengan pemberitahuan tertulis [60] hari sebelumnya. Pekerjaan yang sudah selesai sampai tanggal itu tetap dibayar sebanding.</w:t>
+      </w:r>
+    </w:p>
+    <w:p>
+      <w:pPr>
+        <w:pStyle w:val="ListParagraph"/>
+        <w:numPr>
+          <w:ilvl w:val="0"/>
+          <w:numId w:val="10"/>
         </w:numPr>
         <w:spacing w:after="80"/>
         <w:jc w:val="both"/>
@@ -938,13 +1065,13 @@
         <w:pStyle w:val="ListParagraph"/>
         <w:numPr>
           <w:ilvl w:val="0"/>
-          <w:numId w:val="8"/>
-        </w:numPr>
-        <w:spacing w:after="80"/>
-        <w:jc w:val="both"/>
-      </w:pPr>
-      <w:r>
-        <w:t xml:space="preserve">Setelah berakhir, PIHAK KEDUA berhenti memakai merek dan sistem Hydromart serta melunasi seluruh kewajiban yang tertunggak.</w:t>
+          <w:numId w:val="10"/>
+        </w:numPr>
+        <w:spacing w:after="80"/>
+        <w:jc w:val="both"/>
+      </w:pPr>
+      <w:r>
+        <w:t xml:space="preserve">Setelah berakhir, PIHAK KEDUA menyerahkan data sesuai Pasal 5 ayat 5, dan PIHAK PERTAMA melunasi seluruh kewajiban yang tertunggak.</w:t>
       </w:r>
     </w:p>
     <w:p>
@@ -954,43 +1081,29 @@
         <w:jc w:val="center"/>
       </w:pPr>
       <w:r>
-        <w:t xml:space="preserve">Pasal 8 – Penyelesaian Sengketa dan Hukum yang Berlaku</w:t>
-      </w:r>
-    </w:p>
-    <w:p>
-      <w:pPr>
-        <w:pStyle w:val="ListParagraph"/>
-        <w:numPr>
-          <w:ilvl w:val="0"/>
-          <w:numId w:val="9"/>
-        </w:numPr>
-        <w:spacing w:after="80"/>
-        <w:jc w:val="both"/>
-      </w:pPr>
-      <w:r>
-        <w:t xml:space="preserve">Sengketa diselesaikan lebih dulu dengan musyawarah dalam [30] hari.</w:t>
-      </w:r>
-    </w:p>
-    <w:p>
-      <w:pPr>
-        <w:pStyle w:val="ListParagraph"/>
-        <w:numPr>
-          <w:ilvl w:val="0"/>
-          <w:numId w:val="9"/>
-        </w:numPr>
-        <w:spacing w:after="80"/>
-        <w:jc w:val="both"/>
-      </w:pPr>
-      <w:r>
-        <w:t xml:space="preserve">Bila gagal, sengketa diselesaikan di [Pengadilan Negeri ... / BANI].</w:t>
-      </w:r>
-    </w:p>
-    <w:p>
-      <w:pPr>
-        <w:pStyle w:val="ListParagraph"/>
-        <w:numPr>
-          <w:ilvl w:val="0"/>
-          <w:numId w:val="9"/>
+        <w:t xml:space="preserve">Pasal 9 – Penyelesaian Sengketa dan Penutup</w:t>
+      </w:r>
+    </w:p>
+    <w:p>
+      <w:pPr>
+        <w:pStyle w:val="ListParagraph"/>
+        <w:numPr>
+          <w:ilvl w:val="0"/>
+          <w:numId w:val="11"/>
+        </w:numPr>
+        <w:spacing w:after="80"/>
+        <w:jc w:val="both"/>
+      </w:pPr>
+      <w:r>
+        <w:t xml:space="preserve">Sengketa diselesaikan lebih dulu dengan musyawarah dalam [30] hari. Bila gagal, sengketa diselesaikan di [Pengadilan Negeri ... / BANI].</w:t>
+      </w:r>
+    </w:p>
+    <w:p>
+      <w:pPr>
+        <w:pStyle w:val="ListParagraph"/>
+        <w:numPr>
+          <w:ilvl w:val="0"/>
+          <w:numId w:val="11"/>
         </w:numPr>
         <w:spacing w:after="80"/>
         <w:jc w:val="both"/>
@@ -1001,20 +1114,10 @@
     </w:p>
     <w:p>
       <w:pPr>
-        <w:pStyle w:val="Heading2"/>
-        <w:keepNext/>
-        <w:jc w:val="center"/>
-      </w:pPr>
-      <w:r>
-        <w:t xml:space="preserve">Pasal 9 – Penutup</w:t>
-      </w:r>
-    </w:p>
-    <w:p>
-      <w:pPr>
-        <w:pStyle w:val="ListParagraph"/>
-        <w:numPr>
-          <w:ilvl w:val="0"/>
-          <w:numId w:val="10"/>
+        <w:pStyle w:val="ListParagraph"/>
+        <w:numPr>
+          <w:ilvl w:val="0"/>
+          <w:numId w:val="11"/>
         </w:numPr>
         <w:spacing w:after="80"/>
         <w:jc w:val="both"/>
@@ -1028,7 +1131,7 @@
         <w:pStyle w:val="ListParagraph"/>
         <w:numPr>
           <w:ilvl w:val="0"/>
-          <w:numId w:val="10"/>
+          <w:numId w:val="11"/>
         </w:numPr>
         <w:spacing w:after="80"/>
         <w:jc w:val="both"/>
@@ -1222,6 +1325,442 @@
                 <w:bCs w:val="false"/>
               </w:rPr>
               <w:t xml:space="preserve">[Nama], [Jabatan]</w:t>
+            </w:r>
+          </w:p>
+        </w:tc>
+      </w:tr>
+    </w:tbl>
+    <w:p>
+      <w:r>
+        <w:br w:type="page"/>
+      </w:r>
+    </w:p>
+    <w:p>
+      <w:pPr>
+        <w:spacing w:after="120"/>
+        <w:jc w:val="center"/>
+      </w:pPr>
+      <w:r>
+        <w:rPr>
+          <w:b/>
+          <w:bCs/>
+        </w:rPr>
+        <w:t xml:space="preserve">LAMPIRAN A – SPESIFIKASI DAN JADWAL</w:t>
+      </w:r>
+    </w:p>
+    <w:tbl>
+      <w:tblPr>
+        <w:tblW w:type="dxa" w:w="9026"/>
+        <w:tblBorders>
+          <w:top w:val="single" w:color="auto" w:sz="4"/>
+          <w:left w:val="single" w:color="auto" w:sz="4"/>
+          <w:bottom w:val="single" w:color="auto" w:sz="4"/>
+          <w:right w:val="single" w:color="auto" w:sz="4"/>
+          <w:insideH w:val="single" w:color="auto" w:sz="4"/>
+          <w:insideV w:val="single" w:color="auto" w:sz="4"/>
+        </w:tblBorders>
+      </w:tblPr>
+      <w:tblGrid>
+        <w:gridCol w:w="3000"/>
+        <w:gridCol w:w="3526"/>
+        <w:gridCol w:w="2500"/>
+      </w:tblGrid>
+      <w:tr>
+        <w:tc>
+          <w:tcPr>
+            <w:tcW w:type="dxa" w:w="3000"/>
+            <w:tcBorders>
+              <w:top w:val="single" w:color="000000" w:sz="4"/>
+              <w:left w:val="single" w:color="000000" w:sz="4"/>
+              <w:bottom w:val="single" w:color="000000" w:sz="4"/>
+              <w:right w:val="single" w:color="000000" w:sz="4"/>
+            </w:tcBorders>
+            <w:tcMar>
+              <w:top w:type="dxa" w:w="60"/>
+              <w:left w:type="dxa" w:w="100"/>
+              <w:bottom w:type="dxa" w:w="60"/>
+              <w:right w:type="dxa" w:w="100"/>
+            </w:tcMar>
+          </w:tcPr>
+          <w:p>
+            <w:r>
+              <w:rPr>
+                <w:b/>
+                <w:bCs/>
+              </w:rPr>
+              <w:t xml:space="preserve">Modul / fitur</w:t>
+            </w:r>
+          </w:p>
+        </w:tc>
+        <w:tc>
+          <w:tcPr>
+            <w:tcW w:type="dxa" w:w="3526"/>
+            <w:tcBorders>
+              <w:top w:val="single" w:color="000000" w:sz="4"/>
+              <w:left w:val="single" w:color="000000" w:sz="4"/>
+              <w:bottom w:val="single" w:color="000000" w:sz="4"/>
+              <w:right w:val="single" w:color="000000" w:sz="4"/>
+            </w:tcBorders>
+            <w:tcMar>
+              <w:top w:type="dxa" w:w="60"/>
+              <w:left w:type="dxa" w:w="100"/>
+              <w:bottom w:type="dxa" w:w="60"/>
+              <w:right w:type="dxa" w:w="100"/>
+            </w:tcMar>
+          </w:tcPr>
+          <w:p>
+            <w:r>
+              <w:rPr>
+                <w:b/>
+                <w:bCs/>
+              </w:rPr>
+              <w:t xml:space="preserve">Deskripsi singkat</w:t>
+            </w:r>
+          </w:p>
+        </w:tc>
+        <w:tc>
+          <w:tcPr>
+            <w:tcW w:type="dxa" w:w="2500"/>
+            <w:tcBorders>
+              <w:top w:val="single" w:color="000000" w:sz="4"/>
+              <w:left w:val="single" w:color="000000" w:sz="4"/>
+              <w:bottom w:val="single" w:color="000000" w:sz="4"/>
+              <w:right w:val="single" w:color="000000" w:sz="4"/>
+            </w:tcBorders>
+            <w:tcMar>
+              <w:top w:type="dxa" w:w="60"/>
+              <w:left w:type="dxa" w:w="100"/>
+              <w:bottom w:type="dxa" w:w="60"/>
+              <w:right w:type="dxa" w:w="100"/>
+            </w:tcMar>
+          </w:tcPr>
+          <w:p>
+            <w:r>
+              <w:rPr>
+                <w:b/>
+                <w:bCs/>
+              </w:rPr>
+              <w:t xml:space="preserve">Target selesai</w:t>
+            </w:r>
+          </w:p>
+        </w:tc>
+      </w:tr>
+      <w:tr>
+        <w:tc>
+          <w:tcPr>
+            <w:tcW w:type="dxa" w:w="3000"/>
+            <w:tcBorders>
+              <w:top w:val="single" w:color="000000" w:sz="4"/>
+              <w:left w:val="single" w:color="000000" w:sz="4"/>
+              <w:bottom w:val="single" w:color="000000" w:sz="4"/>
+              <w:right w:val="single" w:color="000000" w:sz="4"/>
+            </w:tcBorders>
+            <w:tcMar>
+              <w:top w:type="dxa" w:w="60"/>
+              <w:left w:type="dxa" w:w="100"/>
+              <w:bottom w:type="dxa" w:w="60"/>
+              <w:right w:type="dxa" w:w="100"/>
+            </w:tcMar>
+          </w:tcPr>
+          <w:p>
+            <w:r>
+              <w:rPr>
+                <w:b w:val="false"/>
+                <w:bCs w:val="false"/>
+              </w:rPr>
+              <w:t xml:space="preserve">[mis. Aplikasi pelanggan]</w:t>
+            </w:r>
+          </w:p>
+        </w:tc>
+        <w:tc>
+          <w:tcPr>
+            <w:tcW w:type="dxa" w:w="3526"/>
+            <w:tcBorders>
+              <w:top w:val="single" w:color="000000" w:sz="4"/>
+              <w:left w:val="single" w:color="000000" w:sz="4"/>
+              <w:bottom w:val="single" w:color="000000" w:sz="4"/>
+              <w:right w:val="single" w:color="000000" w:sz="4"/>
+            </w:tcBorders>
+            <w:tcMar>
+              <w:top w:type="dxa" w:w="60"/>
+              <w:left w:type="dxa" w:w="100"/>
+              <w:bottom w:type="dxa" w:w="60"/>
+              <w:right w:type="dxa" w:w="100"/>
+            </w:tcMar>
+          </w:tcPr>
+          <w:p>
+            <w:r>
+              <w:rPr>
+                <w:b w:val="false"/>
+                <w:bCs w:val="false"/>
+              </w:rPr>
+              <w:t xml:space="preserve">[uraian]</w:t>
+            </w:r>
+          </w:p>
+        </w:tc>
+        <w:tc>
+          <w:tcPr>
+            <w:tcW w:type="dxa" w:w="2500"/>
+            <w:tcBorders>
+              <w:top w:val="single" w:color="000000" w:sz="4"/>
+              <w:left w:val="single" w:color="000000" w:sz="4"/>
+              <w:bottom w:val="single" w:color="000000" w:sz="4"/>
+              <w:right w:val="single" w:color="000000" w:sz="4"/>
+            </w:tcBorders>
+            <w:tcMar>
+              <w:top w:type="dxa" w:w="60"/>
+              <w:left w:type="dxa" w:w="100"/>
+              <w:bottom w:type="dxa" w:w="60"/>
+              <w:right w:type="dxa" w:w="100"/>
+            </w:tcMar>
+          </w:tcPr>
+          <w:p>
+            <w:r>
+              <w:rPr>
+                <w:b w:val="false"/>
+                <w:bCs w:val="false"/>
+              </w:rPr>
+              <w:t xml:space="preserve">[tanggal]</w:t>
+            </w:r>
+          </w:p>
+        </w:tc>
+      </w:tr>
+      <w:tr>
+        <w:tc>
+          <w:tcPr>
+            <w:tcW w:type="dxa" w:w="3000"/>
+            <w:tcBorders>
+              <w:top w:val="single" w:color="000000" w:sz="4"/>
+              <w:left w:val="single" w:color="000000" w:sz="4"/>
+              <w:bottom w:val="single" w:color="000000" w:sz="4"/>
+              <w:right w:val="single" w:color="000000" w:sz="4"/>
+            </w:tcBorders>
+            <w:tcMar>
+              <w:top w:type="dxa" w:w="60"/>
+              <w:left w:type="dxa" w:w="100"/>
+              <w:bottom w:type="dxa" w:w="60"/>
+              <w:right w:type="dxa" w:w="100"/>
+            </w:tcMar>
+          </w:tcPr>
+          <w:p>
+            <w:r>
+              <w:rPr>
+                <w:b w:val="false"/>
+                <w:bCs w:val="false"/>
+              </w:rPr>
+              <w:t xml:space="preserve">[mis. Aplikasi kurir]</w:t>
+            </w:r>
+          </w:p>
+        </w:tc>
+        <w:tc>
+          <w:tcPr>
+            <w:tcW w:type="dxa" w:w="3526"/>
+            <w:tcBorders>
+              <w:top w:val="single" w:color="000000" w:sz="4"/>
+              <w:left w:val="single" w:color="000000" w:sz="4"/>
+              <w:bottom w:val="single" w:color="000000" w:sz="4"/>
+              <w:right w:val="single" w:color="000000" w:sz="4"/>
+            </w:tcBorders>
+            <w:tcMar>
+              <w:top w:type="dxa" w:w="60"/>
+              <w:left w:type="dxa" w:w="100"/>
+              <w:bottom w:type="dxa" w:w="60"/>
+              <w:right w:type="dxa" w:w="100"/>
+            </w:tcMar>
+          </w:tcPr>
+          <w:p>
+            <w:r>
+              <w:rPr>
+                <w:b w:val="false"/>
+                <w:bCs w:val="false"/>
+              </w:rPr>
+              <w:t xml:space="preserve">[uraian]</w:t>
+            </w:r>
+          </w:p>
+        </w:tc>
+        <w:tc>
+          <w:tcPr>
+            <w:tcW w:type="dxa" w:w="2500"/>
+            <w:tcBorders>
+              <w:top w:val="single" w:color="000000" w:sz="4"/>
+              <w:left w:val="single" w:color="000000" w:sz="4"/>
+              <w:bottom w:val="single" w:color="000000" w:sz="4"/>
+              <w:right w:val="single" w:color="000000" w:sz="4"/>
+            </w:tcBorders>
+            <w:tcMar>
+              <w:top w:type="dxa" w:w="60"/>
+              <w:left w:type="dxa" w:w="100"/>
+              <w:bottom w:type="dxa" w:w="60"/>
+              <w:right w:type="dxa" w:w="100"/>
+            </w:tcMar>
+          </w:tcPr>
+          <w:p>
+            <w:r>
+              <w:rPr>
+                <w:b w:val="false"/>
+                <w:bCs w:val="false"/>
+              </w:rPr>
+              <w:t xml:space="preserve">[tanggal]</w:t>
+            </w:r>
+          </w:p>
+        </w:tc>
+      </w:tr>
+      <w:tr>
+        <w:tc>
+          <w:tcPr>
+            <w:tcW w:type="dxa" w:w="3000"/>
+            <w:tcBorders>
+              <w:top w:val="single" w:color="000000" w:sz="4"/>
+              <w:left w:val="single" w:color="000000" w:sz="4"/>
+              <w:bottom w:val="single" w:color="000000" w:sz="4"/>
+              <w:right w:val="single" w:color="000000" w:sz="4"/>
+            </w:tcBorders>
+            <w:tcMar>
+              <w:top w:type="dxa" w:w="60"/>
+              <w:left w:type="dxa" w:w="100"/>
+              <w:bottom w:type="dxa" w:w="60"/>
+              <w:right w:type="dxa" w:w="100"/>
+            </w:tcMar>
+          </w:tcPr>
+          <w:p>
+            <w:r>
+              <w:rPr>
+                <w:b w:val="false"/>
+                <w:bCs w:val="false"/>
+              </w:rPr>
+              <w:t xml:space="preserve">[mis. Admin depot]</w:t>
+            </w:r>
+          </w:p>
+        </w:tc>
+        <w:tc>
+          <w:tcPr>
+            <w:tcW w:type="dxa" w:w="3526"/>
+            <w:tcBorders>
+              <w:top w:val="single" w:color="000000" w:sz="4"/>
+              <w:left w:val="single" w:color="000000" w:sz="4"/>
+              <w:bottom w:val="single" w:color="000000" w:sz="4"/>
+              <w:right w:val="single" w:color="000000" w:sz="4"/>
+            </w:tcBorders>
+            <w:tcMar>
+              <w:top w:type="dxa" w:w="60"/>
+              <w:left w:type="dxa" w:w="100"/>
+              <w:bottom w:type="dxa" w:w="60"/>
+              <w:right w:type="dxa" w:w="100"/>
+            </w:tcMar>
+          </w:tcPr>
+          <w:p>
+            <w:r>
+              <w:rPr>
+                <w:b w:val="false"/>
+                <w:bCs w:val="false"/>
+              </w:rPr>
+              <w:t xml:space="preserve">[uraian]</w:t>
+            </w:r>
+          </w:p>
+        </w:tc>
+        <w:tc>
+          <w:tcPr>
+            <w:tcW w:type="dxa" w:w="2500"/>
+            <w:tcBorders>
+              <w:top w:val="single" w:color="000000" w:sz="4"/>
+              <w:left w:val="single" w:color="000000" w:sz="4"/>
+              <w:bottom w:val="single" w:color="000000" w:sz="4"/>
+              <w:right w:val="single" w:color="000000" w:sz="4"/>
+            </w:tcBorders>
+            <w:tcMar>
+              <w:top w:type="dxa" w:w="60"/>
+              <w:left w:type="dxa" w:w="100"/>
+              <w:bottom w:type="dxa" w:w="60"/>
+              <w:right w:type="dxa" w:w="100"/>
+            </w:tcMar>
+          </w:tcPr>
+          <w:p>
+            <w:r>
+              <w:rPr>
+                <w:b w:val="false"/>
+                <w:bCs w:val="false"/>
+              </w:rPr>
+              <w:t xml:space="preserve">[tanggal]</w:t>
+            </w:r>
+          </w:p>
+        </w:tc>
+      </w:tr>
+      <w:tr>
+        <w:tc>
+          <w:tcPr>
+            <w:tcW w:type="dxa" w:w="3000"/>
+            <w:tcBorders>
+              <w:top w:val="single" w:color="000000" w:sz="4"/>
+              <w:left w:val="single" w:color="000000" w:sz="4"/>
+              <w:bottom w:val="single" w:color="000000" w:sz="4"/>
+              <w:right w:val="single" w:color="000000" w:sz="4"/>
+            </w:tcBorders>
+            <w:tcMar>
+              <w:top w:type="dxa" w:w="60"/>
+              <w:left w:type="dxa" w:w="100"/>
+              <w:bottom w:type="dxa" w:w="60"/>
+              <w:right w:type="dxa" w:w="100"/>
+            </w:tcMar>
+          </w:tcPr>
+          <w:p>
+            <w:r>
+              <w:rPr>
+                <w:b w:val="false"/>
+                <w:bCs w:val="false"/>
+              </w:rPr>
+              <w:t xml:space="preserve">[mis. Portal waralaba dan kantor pusat]</w:t>
+            </w:r>
+          </w:p>
+        </w:tc>
+        <w:tc>
+          <w:tcPr>
+            <w:tcW w:type="dxa" w:w="3526"/>
+            <w:tcBorders>
+              <w:top w:val="single" w:color="000000" w:sz="4"/>
+              <w:left w:val="single" w:color="000000" w:sz="4"/>
+              <w:bottom w:val="single" w:color="000000" w:sz="4"/>
+              <w:right w:val="single" w:color="000000" w:sz="4"/>
+            </w:tcBorders>
+            <w:tcMar>
+              <w:top w:type="dxa" w:w="60"/>
+              <w:left w:type="dxa" w:w="100"/>
+              <w:bottom w:type="dxa" w:w="60"/>
+              <w:right w:type="dxa" w:w="100"/>
+            </w:tcMar>
+          </w:tcPr>
+          <w:p>
+            <w:r>
+              <w:rPr>
+                <w:b w:val="false"/>
+                <w:bCs w:val="false"/>
+              </w:rPr>
+              <w:t xml:space="preserve">[uraian]</w:t>
+            </w:r>
+          </w:p>
+        </w:tc>
+        <w:tc>
+          <w:tcPr>
+            <w:tcW w:type="dxa" w:w="2500"/>
+            <w:tcBorders>
+              <w:top w:val="single" w:color="000000" w:sz="4"/>
+              <w:left w:val="single" w:color="000000" w:sz="4"/>
+              <w:bottom w:val="single" w:color="000000" w:sz="4"/>
+              <w:right w:val="single" w:color="000000" w:sz="4"/>
+            </w:tcBorders>
+            <w:tcMar>
+              <w:top w:type="dxa" w:w="60"/>
+              <w:left w:type="dxa" w:w="100"/>
+              <w:bottom w:type="dxa" w:w="60"/>
+              <w:right w:type="dxa" w:w="100"/>
+            </w:tcMar>
+          </w:tcPr>
+          <w:p>
+            <w:r>
+              <w:rPr>
+                <w:b w:val="false"/>
+                <w:bCs w:val="false"/>
+              </w:rPr>
+              <w:t xml:space="preserve">[tanggal]</w:t>
             </w:r>
           </w:p>
         </w:tc>
@@ -1498,6 +2037,18 @@
     </w:lvl>
   </w:abstractNum>
   <w:abstractNum w:abstractNumId="10" w15:restartNumberingAfterBreak="0">
+    <w:multiLevelType w:val="hybridMultilevel"/>
+    <w:lvl w:ilvl="0" w15:tentative="1">
+      <w:start w:val="1"/>
+      <w:numFmt w:val="decimal"/>
+      <w:lvlText w:val="%1."/>
+      <w:lvlJc w:val="left"/>
+      <w:pPr>
+        <w:ind w:left="540" w:hanging="360"/>
+      </w:pPr>
+    </w:lvl>
+  </w:abstractNum>
+  <w:abstractNum w:abstractNumId="11" w15:restartNumberingAfterBreak="0">
     <w:multiLevelType w:val="hybridMultilevel"/>
     <w:lvl w:ilvl="0" w15:tentative="1">
       <w:start w:val="1"/>
@@ -1565,6 +2116,12 @@
   </w:num>
   <w:num w:numId="10">
     <w:abstractNumId w:val="10"/>
+    <w:lvlOverride w:ilvl="0">
+      <w:startOverride w:val="1"/>
+    </w:lvlOverride>
+  </w:num>
+  <w:num w:numId="11">
+    <w:abstractNumId w:val="11"/>
     <w:lvlOverride w:ilvl="0">
       <w:startOverride w:val="1"/>
     </w:lvlOverride>

</xml_diff>